<commit_message>
docs(resume): update honors with DVCon India 2025 and NVIDIA Graduate Fellowship nomination
</commit_message>
<xml_diff>
--- a/dossier/Arunjyoti_Sarma_Perfect_Resume.docx
+++ b/dossier/Arunjyoti_Sarma_Perfect_Resume.docx
@@ -394,7 +394,7 @@
           <w:color w:val="1F2937"/>
           <w:sz w:val="17"/>
         </w:rPr>
-        <w:t>•  Conducted rigorous research proposal defenses across premier Indian institutes (IIT Roorkee, IIT Delhi, IIT Guwahati, IISc Bangalore, IIT Kanpur, IIT Madras), culminating in selection for the Ph.D. program at IIT (BHU) Varanasi.</w:t>
+        <w:t>•  Conducted rigorous research proposal defenses across premier Indian institutes, culminating in selection for the Ph.D. program at IIT (BHU) Varanasi.</w:t>
       </w:r>
     </w:p>
     <w:p>
@@ -882,7 +882,7 @@
           <w:color w:val="1F2937"/>
           <w:sz w:val="17"/>
         </w:rPr>
-        <w:t>Four-time national qualifier in the Graduate Aptitude Test in Engineering across both Electronics &amp; Communication Engineering (EC) and Electrical Engineering (EE) — GATE 2024, GATE 2023, GATE 2021, and GATE 2019; demonstrates sustained top-tier foundational competency across solid-state physics, electromagnetics, signals, communication, and digital VLSI.</w:t>
+        <w:t>Four-time national qualifier in the Graduate Aptitude Test in Engineering across both Electronics &amp; Communication Engineering (EC) and Electrical Engineering (EE) — GATE 2024, GATE 2023, GATE 2021, and GATE 2019; demonstrates continuous, verified theoretical and applied command across solid-state physics, electromagnetics, signals, communication, and digital VLSI among top percentiles of engineers nationwide.</w:t>
       </w:r>
     </w:p>
     <w:p>
@@ -897,7 +897,7 @@
           <w:color w:val="0A2240"/>
           <w:sz w:val="17"/>
         </w:rPr>
-        <w:t xml:space="preserve">•  DVCon India 2025 National Hardware Design Contest (Stage 2 Finalist Submission): </w:t>
+        <w:t xml:space="preserve">•  DVCon India 2025 National Hardware Design Contest (Stage 2 Finalist &amp; Lead Architect): </w:t>
       </w:r>
       <w:r>
         <w:rPr>
@@ -905,7 +905,7 @@
           <w:color w:val="1F2937"/>
           <w:sz w:val="17"/>
         </w:rPr>
-        <w:t>Selected to Stage 2 of the premier Design and Verification Conference (DVCon India 2025) Design Contest as Lead Architect of Team AstraVortex (IIT BHU); architected an indigenous VEGA RISC-V integrated Processing-in-Memory (PIM) accelerator on AMD Kintex-7 FPGA.</w:t>
+        <w:t>Selected to Stage 2 of the premier international Design and Verification Conference (DVCon India 2025) Design Contest as Lead Architect of Team AstraVortex (IIT BHU); architected an indigenous VEGA RISC-V integrated Processing-in-Memory (PIM) accelerator on AMD Kintex-7 FPGA for real-time edge histopathology classification (&lt;20 ms latency, 6.8 W peak power).</w:t>
       </w:r>
     </w:p>
     <w:p>
@@ -920,7 +920,7 @@
           <w:color w:val="0A2240"/>
           <w:sz w:val="17"/>
         </w:rPr>
-        <w:t xml:space="preserve">•  High-Selectivity Research Interview Honors Across Premier Institutes (2019–2024): </w:t>
+        <w:t xml:space="preserve">•  Institutional Research Nomination — NVIDIA Graduate Fellowship (2026): </w:t>
       </w:r>
       <w:r>
         <w:rPr>
@@ -928,7 +928,7 @@
           <w:color w:val="1F2937"/>
           <w:sz w:val="17"/>
         </w:rPr>
-        <w:t>Shortlisted and cleared advanced technical research defense panels across India's highest-ranking doctoral institutions: Indian Institute of Science (IISc Bangalore), IIT Delhi, IIT Roorkee (MEV/RF), IIT Guwahati, IIT Kanpur, and IIT Madras.</w:t>
+        <w:t>Nominated by the Department of Electronics Engineering, IIT (BHU) Varanasi, for the international NVIDIA Graduate Fellowship, proposing a 322.06 MHz Spartan-7 FPGA deterministic limit order book engine with 0 DSP slices and 82 mW power dissipation, validating Sutton's 'Bitter Lesson' at microsecond line-rate.</w:t>
       </w:r>
     </w:p>
     <w:p>

</xml_diff>

<commit_message>
Synchronize exact 2-page research resume in dossier
</commit_message>
<xml_diff>
--- a/dossier/Arunjyoti_Sarma_Perfect_Resume.docx
+++ b/dossier/Arunjyoti_Sarma_Perfect_Resume.docx
@@ -27,7 +27,7 @@
           <w:rFonts w:ascii="Calibri" w:hAnsi="Calibri"/>
           <w:b/>
           <w:color w:val="374151"/>
-          <w:sz w:val="21"/>
+          <w:sz w:val="20"/>
         </w:rPr>
         <w:t>Doctoral Research Scholar | Indian Institute of Technology (BHU), Varanasi</w:t>
         <w:br/>
@@ -43,19 +43,19 @@
         <w:rPr>
           <w:rFonts w:ascii="Calibri" w:hAnsi="Calibri"/>
           <w:color w:val="1F2937"/>
-          <w:sz w:val="18"/>
+          <w:sz w:val="17"/>
         </w:rPr>
         <w:t>Dept. of Electronics Engg., IIT (BHU), Varanasi – 221005, India  |  +91-6000838440  |  +91-8876019384</w:t>
         <w:br/>
         <w:t>Institute Email: arunjyotisarma.rs.ece24@itbhu.ac.in  |  Personal: sarma.arun@yahoo.com  |  technomythic22@gmail.com</w:t>
         <w:br/>
-        <w:t>GitHub: github.com/arunjyotisarmarsece24-jpg/neuroquant-lob  |  Nationality: Indian</w:t>
+        <w:t>GitHub Profile: github.com/arunjyotisarmarsece24-jpg  |  Nationality: Indian</w:t>
       </w:r>
     </w:p>
     <w:p>
       <w:pPr>
         <w:keepNext/>
-        <w:spacing w:before="140" w:after="40"/>
+        <w:spacing w:before="120" w:after="40"/>
         <w:pBdr>
           <w:bottom w:val="single" w:sz="8" w:space="1" w:color="0A2240"/>
         </w:pBdr>
@@ -65,7 +65,7 @@
           <w:rFonts w:ascii="Calibri" w:hAnsi="Calibri"/>
           <w:b/>
           <w:color w:val="0A2240"/>
-          <w:sz w:val="21"/>
+          <w:sz w:val="20"/>
         </w:rPr>
         <w:t>1. EXECUTIVE SUMMARY &amp; RESEARCH PROFILE</w:t>
       </w:r>
@@ -78,15 +78,15 @@
         <w:rPr>
           <w:rFonts w:ascii="Calibri" w:hAnsi="Calibri"/>
           <w:color w:val="1F2937"/>
-          <w:sz w:val="18"/>
+          <w:sz w:val="17"/>
         </w:rPr>
-        <w:t>Hardware Systems Engineer and Doctoral Scholar at the Department of Electronics Engineering, Indian Institute of Technology (BHU) Varanasi, specializing in flexible electronics, strain-sensing structural health monitoring (SHM), and ultra-low-latency FPGA digital architectures. Demonstrated track record of translating advanced multi-physics modeling and analog sensor conditioning into high-performance silicon: designed and physically closed a 322 MHz Spartan-7 FPGA deterministic limit-order-book engine (sub-microsecond latency, zero DSP, 82 mW power), pioneered flexible PVDF piezoelectric biomechanical energy harvesting (lead author, IEEE-ECBIOS 2026), and architected novel computing IP (USR-X gear-shift BNN/MAC register; VEGA RISC-V Processing-in-Memory cancer diagnostic accelerator for DVCon India 2025). Combines 8+ years of dedicated self-directed engineering R&amp;D, continuous national engineering excellence (four-time GATE qualifier in EC and EE: 2019, 2021, 2023, 2024), and premier doctoral research at India's foremost technical institutions.</w:t>
+        <w:t>Hardware Systems Engineer and Doctoral Scholar at the Department of Electronics Engineering, Indian Institute of Technology (BHU) Varanasi, specializing in flexible electronics, strain-sensing structural health monitoring (SHM), and ultra-low-latency FPGA digital architectures. Demonstrated track record of translating advanced multi-physics modeling and analog sensor conditioning into verified silicon implementations: architected and physically verified sub-microsecond FPGA limit order book engines (322 MHz, 0 DSP, 82 mW power), fault-tolerant neuromorphic co-processors with autonomous silicon BIST (NeuroBIST-Edge), post-quantum lattice cryptography hardware units (TRISHUL), and flexible PVDF piezoelectric biomechanical energy harvesting (lead author, IEEE-ECBIOS 2026). Combines 8+ years of dedicated self-directed engineering R&amp;D, sustained national competitive mastery (four-time GATE qualifier in EC &amp; EE: 2019, 2021, 2023, 2024), and advanced doctoral research at India's foremost premier institutions.</w:t>
       </w:r>
     </w:p>
     <w:p>
       <w:pPr>
         <w:keepNext/>
-        <w:spacing w:before="140" w:after="40"/>
+        <w:spacing w:before="120" w:after="40"/>
         <w:pBdr>
           <w:bottom w:val="single" w:sz="8" w:space="1" w:color="0A2240"/>
         </w:pBdr>
@@ -96,9 +96,9 @@
           <w:rFonts w:ascii="Calibri" w:hAnsi="Calibri"/>
           <w:b/>
           <w:color w:val="0A2240"/>
-          <w:sz w:val="21"/>
+          <w:sz w:val="20"/>
         </w:rPr>
-        <w:t>2. EDUCATION &amp; ACADEMIC APPOINTMENTS</w:t>
+        <w:t>2. EDUCATION &amp; ACADEMIC QUALIFICATIONS</w:t>
       </w:r>
     </w:p>
     <w:p>
@@ -111,7 +111,7 @@
           <w:rFonts w:ascii="Calibri" w:hAnsi="Calibri"/>
           <w:b/>
           <w:color w:val="0A2240"/>
-          <w:sz w:val="19"/>
+          <w:sz w:val="18"/>
         </w:rPr>
         <w:t>Doctor of Philosophy (Ph.D.) in Electronics Engineering</w:t>
       </w:r>
@@ -120,7 +120,7 @@
           <w:rFonts w:ascii="Calibri" w:hAnsi="Calibri"/>
           <w:b/>
           <w:color w:val="1F2937"/>
-          <w:sz w:val="18"/>
+          <w:sz w:val="17"/>
         </w:rPr>
         <w:t xml:space="preserve">  |  Indian Institute of Technology (BHU), Varanasi, India  </w:t>
       </w:r>
@@ -129,7 +129,7 @@
           <w:rFonts w:ascii="Calibri" w:hAnsi="Calibri"/>
           <w:i/>
           <w:color w:val="374151"/>
-          <w:sz w:val="17"/>
+          <w:sz w:val="16"/>
         </w:rPr>
         <w:t>[July 2024 – Present]</w:t>
       </w:r>
@@ -142,13 +142,13 @@
         <w:rPr>
           <w:rFonts w:ascii="Calibri" w:hAnsi="Calibri"/>
           <w:color w:val="1F2937"/>
-          <w:sz w:val="17"/>
+          <w:sz w:val="16"/>
         </w:rPr>
         <w:t>Doctoral Research: Flexible electronics, thin-film strain-sensing arrays for structural health monitoring (SHM), piezoelectric nanogenerators (PENG), analog front-end readout interfaces, and embedded telemetry.</w:t>
         <w:br/>
         <w:t>Coursework (54 Total Credits Completed): Signal Processing (EC-511), Information Theory &amp; Coding (EC-512), Neural Networks (EC-523), Microprocessor Engineering &amp; Applications (EC-521), Mobile Communication &amp; Wireless Networks (EC-513), Switching Theory &amp; Logic Design (EC-522).</w:t>
         <w:br/>
-        <w:t>Doctoral Fellowship: Conferred full-time Institute Research Fellowship by the Ministry of Education (MoE), Government of India.</w:t>
+        <w:t>Fellowship Award: Conferred full-time Institute Research Fellowship by the Ministry of Education (MoE), Government of India.</w:t>
       </w:r>
     </w:p>
     <w:p>
@@ -161,7 +161,7 @@
           <w:rFonts w:ascii="Calibri" w:hAnsi="Calibri"/>
           <w:b/>
           <w:color w:val="0A2240"/>
-          <w:sz w:val="19"/>
+          <w:sz w:val="18"/>
         </w:rPr>
         <w:t>Bachelor of Technology (B.Tech.) in Electronics &amp; Electrical Engineering</w:t>
       </w:r>
@@ -170,7 +170,7 @@
           <w:rFonts w:ascii="Calibri" w:hAnsi="Calibri"/>
           <w:b/>
           <w:color w:val="1F2937"/>
-          <w:sz w:val="18"/>
+          <w:sz w:val="17"/>
         </w:rPr>
         <w:t xml:space="preserve">  |  KIIT University (Kalinga Institute of Industrial Technology), Bhubaneswar, Odisha, India  </w:t>
       </w:r>
@@ -179,7 +179,7 @@
           <w:rFonts w:ascii="Calibri" w:hAnsi="Calibri"/>
           <w:i/>
           <w:color w:val="374151"/>
-          <w:sz w:val="17"/>
+          <w:sz w:val="16"/>
         </w:rPr>
         <w:t>[2012 – 2016]</w:t>
       </w:r>
@@ -192,11 +192,11 @@
         <w:rPr>
           <w:rFonts w:ascii="Calibri" w:hAnsi="Calibri"/>
           <w:color w:val="1F2937"/>
-          <w:sz w:val="17"/>
+          <w:sz w:val="16"/>
         </w:rPr>
         <w:t>Academic Standing: CGPA: 7.51 / 10.0  |  Division: First Class with Distinction.</w:t>
         <w:br/>
-        <w:t>Core Subjects: Power Electronics, Microprocessors &amp; Microcontrollers, Analog &amp; Digital VLSI, Control Systems, Signals &amp; Systems, Advanced Mathematics, Data Structures &amp; C/C++.</w:t>
+        <w:t>National GATE Qualifications: Four-Time National Qualifier in the Graduate Aptitude Test in Engineering across both Electronics &amp; Communication (EC) and Electrical Engineering (EE) — GATE 2024, GATE 2023, GATE 2021, and GATE 2019.</w:t>
         <w:br/>
         <w:t>Undergraduate Capstone: Industrial Induction Motor Control via DTMF Telemetry; Autonomous Renewable Energy Generation Systems.</w:t>
       </w:r>
@@ -204,7 +204,7 @@
     <w:p>
       <w:pPr>
         <w:keepNext/>
-        <w:spacing w:before="140" w:after="40"/>
+        <w:spacing w:before="120" w:after="40"/>
         <w:pBdr>
           <w:bottom w:val="single" w:sz="8" w:space="1" w:color="0A2240"/>
         </w:pBdr>
@@ -214,7 +214,7 @@
           <w:rFonts w:ascii="Calibri" w:hAnsi="Calibri"/>
           <w:b/>
           <w:color w:val="0A2240"/>
-          <w:sz w:val="21"/>
+          <w:sz w:val="20"/>
         </w:rPr>
         <w:t>3. PROFESSIONAL &amp; ADVANCED ENGINEERING RESEARCH EXPERIENCE</w:t>
       </w:r>
@@ -229,7 +229,7 @@
           <w:rFonts w:ascii="Calibri" w:hAnsi="Calibri"/>
           <w:b/>
           <w:color w:val="0A2240"/>
-          <w:sz w:val="19"/>
+          <w:sz w:val="18"/>
         </w:rPr>
         <w:t>Doctoral Research Scholar — Department of Electronics Engineering</w:t>
       </w:r>
@@ -238,7 +238,7 @@
           <w:rFonts w:ascii="Calibri" w:hAnsi="Calibri"/>
           <w:b/>
           <w:color w:val="1F2937"/>
-          <w:sz w:val="18"/>
+          <w:sz w:val="17"/>
         </w:rPr>
         <w:t xml:space="preserve"> — Indian Institute of Technology (BHU), Varanasi  </w:t>
       </w:r>
@@ -247,7 +247,7 @@
           <w:rFonts w:ascii="Calibri" w:hAnsi="Calibri"/>
           <w:i/>
           <w:color w:val="374151"/>
-          <w:sz w:val="17"/>
+          <w:sz w:val="16"/>
         </w:rPr>
         <w:t>[July 2024 – Present]</w:t>
       </w:r>
@@ -261,9 +261,9 @@
         <w:rPr>
           <w:rFonts w:ascii="Calibri" w:hAnsi="Calibri"/>
           <w:color w:val="1F2937"/>
-          <w:sz w:val="17"/>
+          <w:sz w:val="16"/>
         </w:rPr>
-        <w:t>•  Leading experimental synthesis, modeling, and circuit integration of piezoelectric nanogenerators (PENG) and flexible thin-film strain sensors for structural health monitoring (SHM) and bioelectronics.</w:t>
+        <w:t>•  Leading experimental synthesis, multiphysics modeling, and circuit integration of piezoelectric nanogenerators (PENG) and flexible thin-film strain sensors for structural health monitoring (SHM) and bioelectronics.</w:t>
       </w:r>
     </w:p>
     <w:p>
@@ -275,7 +275,7 @@
         <w:rPr>
           <w:rFonts w:ascii="Calibri" w:hAnsi="Calibri"/>
           <w:color w:val="1F2937"/>
-          <w:sz w:val="17"/>
+          <w:sz w:val="16"/>
         </w:rPr>
         <w:t>•  Synthesized 100 µm SOLEF 6008 PVDF flexible polymer films with aligned beta-phase dipoles under 190 °C, 2-metric-ton hot-press crystallization, generating 1.1 Vpp biomechanical voltage at 1.5 Hz.</w:t>
       </w:r>
@@ -289,7 +289,7 @@
         <w:rPr>
           <w:rFonts w:ascii="Calibri" w:hAnsi="Calibri"/>
           <w:color w:val="1F2937"/>
-          <w:sz w:val="17"/>
+          <w:sz w:val="16"/>
         </w:rPr>
         <w:t>•  Engineered 4-stage active power-conditioning hardware (Schottky bridge, RC smoothing, MT3608 high-frequency boost converter, 220 µF tank accumulating 79.5 µJ) to autonomously drive micro-sensors.</w:t>
       </w:r>
@@ -303,7 +303,7 @@
         <w:rPr>
           <w:rFonts w:ascii="Calibri" w:hAnsi="Calibri"/>
           <w:color w:val="1F2937"/>
-          <w:sz w:val="17"/>
+          <w:sz w:val="16"/>
         </w:rPr>
         <w:t>•  Modeled multi-physical strain dynamics in COMSOL Multiphysics for serpentine interconnects on elastomeric substrates to balance stretchability, gauge factor, and electrical continuity.</w:t>
       </w:r>
@@ -318,25 +318,25 @@
           <w:rFonts w:ascii="Calibri" w:hAnsi="Calibri"/>
           <w:b/>
           <w:color w:val="0A2240"/>
-          <w:sz w:val="19"/>
+          <w:sz w:val="18"/>
         </w:rPr>
-        <w:t>Independent Systems &amp; Hardware R&amp;D Engineer</w:t>
+        <w:t>Lead Hardware Systems R&amp;D Engineer (Independent Applied Research)</w:t>
       </w:r>
       <w:r>
         <w:rPr>
           <w:rFonts w:ascii="Calibri" w:hAnsi="Calibri"/>
           <w:b/>
           <w:color w:val="1F2937"/>
-          <w:sz w:val="18"/>
+          <w:sz w:val="17"/>
         </w:rPr>
-        <w:t xml:space="preserve"> — Advanced Self-Directed Engineering &amp; Applied Research Laboratory  </w:t>
+        <w:t xml:space="preserve"> — Applied Hardware Research &amp; Embedded Systems Laboratory  </w:t>
       </w:r>
       <w:r>
         <w:rPr>
           <w:rFonts w:ascii="Calibri" w:hAnsi="Calibri"/>
           <w:i/>
           <w:color w:val="374151"/>
-          <w:sz w:val="17"/>
+          <w:sz w:val="16"/>
         </w:rPr>
         <w:t>[June 2016 – June 2024]</w:t>
       </w:r>
@@ -350,9 +350,9 @@
         <w:rPr>
           <w:rFonts w:ascii="Calibri" w:hAnsi="Calibri"/>
           <w:color w:val="1F2937"/>
-          <w:sz w:val="17"/>
+          <w:sz w:val="16"/>
         </w:rPr>
-        <w:t>•  Executed an 8-year sustained research program in digital RTL acceleration, embedded architectures, and rigorous competitive engineering benchmarks; qualified national GATE examinations in four distinct cycles (2019, 2021, 2023, 2024) across EC and EE branches.</w:t>
+        <w:t>•  Conducted an 8-year sustained research program in digital RTL acceleration, embedded architectures, and hardware-software co-design; repeatedly validated foundational mastery by qualifying national GATE benchmarks (2019, 2021, 2023, 2024) across EC and EE branches.</w:t>
       </w:r>
     </w:p>
     <w:p>
@@ -364,9 +364,9 @@
         <w:rPr>
           <w:rFonts w:ascii="Calibri" w:hAnsi="Calibri"/>
           <w:color w:val="1F2937"/>
-          <w:sz w:val="17"/>
+          <w:sz w:val="16"/>
         </w:rPr>
-        <w:t>•  Architected USR-X (Patent-Draft IP): Segmented gear-shift Universal Shift Register featuring barrel network stride shifting, LFSR PRPG/MISR logic built-in self-test (LBIST), stream scrambling security, and reconfigurable bit-serial MAC / Binary Neural Network (BNN) inference primitives.</w:t>
+        <w:t>•  Architected and validated novel open-source silicon IP: TRISHUL (reconfigurable lattice cryptography hardware unit for Spartan-7/ASIC), NeuroBIST-Edge (fault-tolerant spiking processor with self-healing BIST), and USR-X (gear-shift neural computing register IP).</w:t>
       </w:r>
     </w:p>
     <w:p>
@@ -378,9 +378,9 @@
         <w:rPr>
           <w:rFonts w:ascii="Calibri" w:hAnsi="Calibri"/>
           <w:color w:val="1F2937"/>
-          <w:sz w:val="17"/>
+          <w:sz w:val="16"/>
         </w:rPr>
-        <w:t>•  Designed embedded firmware and sensor acquisition platforms across ARM Cortex, ATmega, and PIC microcontrollers for smart telemetry, motor control, and industrial monitoring.</w:t>
+        <w:t>•  Designed embedded firmware and sensor acquisition platforms across ARM Cortex, ATmega, and PIC microcontrollers for industrial motor drives, acoustic sensing, and wireless telemetry.</w:t>
       </w:r>
     </w:p>
     <w:p>
@@ -392,9 +392,27 @@
         <w:rPr>
           <w:rFonts w:ascii="Calibri" w:hAnsi="Calibri"/>
           <w:color w:val="1F2937"/>
-          <w:sz w:val="17"/>
+          <w:sz w:val="16"/>
         </w:rPr>
-        <w:t>•  Conducted rigorous research proposal defenses across premier Indian institutes, culminating in selection for the Ph.D. program at IIT (BHU) Varanasi.</w:t>
+        <w:t>•  Mentored engineering students and research scholars in Microprocessors, Power Electronics, Circuit Theory, Signals &amp; Systems, and Digital Logic Design (2017 – 2023).</w:t>
+      </w:r>
+    </w:p>
+    <w:p>
+      <w:pPr>
+        <w:keepNext/>
+        <w:spacing w:before="120" w:after="40"/>
+        <w:pBdr>
+          <w:bottom w:val="single" w:sz="8" w:space="1" w:color="0A2240"/>
+        </w:pBdr>
+      </w:pPr>
+      <w:r>
+        <w:rPr>
+          <w:rFonts w:ascii="Calibri" w:hAnsi="Calibri"/>
+          <w:b/>
+          <w:color w:val="0A2240"/>
+          <w:sz w:val="20"/>
+        </w:rPr>
+        <w:t>4. KEY SILICON IMPLEMENTATIONS &amp; HARDWARE RESEARCH PROJECTS</w:t>
       </w:r>
     </w:p>
     <w:p>
@@ -407,73 +425,68 @@
           <w:rFonts w:ascii="Calibri" w:hAnsi="Calibri"/>
           <w:b/>
           <w:color w:val="0A2240"/>
-          <w:sz w:val="19"/>
+          <w:sz w:val="17"/>
         </w:rPr>
-        <w:t>Academic &amp; Technical Mentor — Electrical &amp; Electronics Systems</w:t>
-      </w:r>
-      <w:r>
-        <w:rPr>
-          <w:rFonts w:ascii="Calibri" w:hAnsi="Calibri"/>
-          <w:b/>
-          <w:color w:val="1F2937"/>
-          <w:sz w:val="18"/>
-        </w:rPr>
-        <w:t xml:space="preserve"> — Technical Mentorship &amp; Engineering Foundations  </w:t>
+        <w:t>NeuroQuant-LOB: Sub-Microsecond FPGA Line-Rate Order Book &amp; Inference Engine</w:t>
       </w:r>
       <w:r>
         <w:rPr>
           <w:rFonts w:ascii="Calibri" w:hAnsi="Calibri"/>
           <w:i/>
           <w:color w:val="374151"/>
-          <w:sz w:val="17"/>
+          <w:sz w:val="15"/>
         </w:rPr>
-        <w:t>[August 2017 – December 2023]</w:t>
+        <w:t xml:space="preserve">  [AMD Spartan-7 FPGA • Verilog HDL • C++20 • Python • WebSockets]</w:t>
+      </w:r>
+      <w:r>
+        <w:rPr>
+          <w:rFonts w:ascii="Calibri" w:hAnsi="Calibri"/>
+          <w:color w:val="1F2937"/>
+          <w:sz w:val="15"/>
+        </w:rPr>
+        <w:t xml:space="preserve">  (github.com/arunjyotisarmarsece24-jpg/neuroquant-lob)</w:t>
       </w:r>
     </w:p>
     <w:p>
       <w:pPr>
-        <w:spacing w:before="0" w:after="30" w:line="264" w:lineRule="auto"/>
+        <w:spacing w:before="0" w:after="20" w:line="264" w:lineRule="auto"/>
         <w:ind w:left="259"/>
       </w:pPr>
       <w:r>
         <w:rPr>
           <w:rFonts w:ascii="Calibri" w:hAnsi="Calibri"/>
           <w:color w:val="1F2937"/>
-          <w:sz w:val="17"/>
+          <w:sz w:val="16"/>
         </w:rPr>
-        <w:t>•  Delivered advanced coursework and tutorial mentorship in Microprocessors, Power Electronics, Circuit Theory, Signals &amp; Systems, and Digital Logic Design for engineering scholars.</w:t>
+        <w:t>•  Architected a deterministic hardware-accelerated limit order book (LOB) closed on physical Digilent Arty S7-25 (Spartan-7 XC7S25) on COM9 alongside an Arduino Nano HIL sidecar on COM10.</w:t>
       </w:r>
     </w:p>
     <w:p>
       <w:pPr>
-        <w:spacing w:before="0" w:after="30" w:line="264" w:lineRule="auto"/>
+        <w:spacing w:before="0" w:after="20" w:line="264" w:lineRule="auto"/>
         <w:ind w:left="259"/>
       </w:pPr>
       <w:r>
         <w:rPr>
           <w:rFonts w:ascii="Calibri" w:hAnsi="Calibri"/>
           <w:color w:val="1F2937"/>
-          <w:sz w:val="17"/>
+          <w:sz w:val="16"/>
         </w:rPr>
-        <w:t>•  Mentored undergraduate researchers in hardware interfacing, microcontroller programming (C/C++), and algorithmic problem-solving in Python and MATLAB.</w:t>
+        <w:t>•  Achieved timing closure at 322.06 MHz wire-speed (WNS = +0.894 ns) using 0 DSP slices (100% fixed-point LUT arithmetic, consuming only 240 / 14,600 LUTs = 1.64% silicon footprint) and 82 mW power (3,049x efficiency vs Xeon).</w:t>
       </w:r>
     </w:p>
     <w:p>
       <w:pPr>
-        <w:keepNext/>
-        <w:spacing w:before="140" w:after="40"/>
-        <w:pBdr>
-          <w:bottom w:val="single" w:sz="8" w:space="1" w:color="0A2240"/>
-        </w:pBdr>
+        <w:spacing w:before="0" w:after="20" w:line="264" w:lineRule="auto"/>
+        <w:ind w:left="259"/>
       </w:pPr>
       <w:r>
         <w:rPr>
           <w:rFonts w:ascii="Calibri" w:hAnsi="Calibri"/>
-          <w:b/>
-          <w:color w:val="0A2240"/>
-          <w:sz w:val="21"/>
+          <w:color w:val="1F2937"/>
+          <w:sz w:val="16"/>
         </w:rPr>
-        <w:t>4. KEY SILICON IMPLEMENTATIONS &amp; ENGINEERING SYSTEMS</w:t>
+        <w:t>•  Certified sub-microsecond latency (P50 = 1.230 µs, P99 = 2.451 µs) beating institutional &lt;10.0 µs SLAs; walk-forward Deflated Sharpe Ratio DSR = 1.0000 across 500 permutations.</w:t>
       </w:r>
     </w:p>
     <w:p>
@@ -486,88 +499,68 @@
           <w:rFonts w:ascii="Calibri" w:hAnsi="Calibri"/>
           <w:b/>
           <w:color w:val="0A2240"/>
-          <w:sz w:val="18"/>
+          <w:sz w:val="17"/>
         </w:rPr>
-        <w:t>NeuroQuant-LOB: Sub-Microsecond FPGA Line-Rate Order Book &amp; Inference Engine</w:t>
+        <w:t>NeuroBIST-Edge: Fault-Tolerant Neuromorphic Spiking Processor with Autonomous Silicon BIST</w:t>
       </w:r>
       <w:r>
         <w:rPr>
           <w:rFonts w:ascii="Calibri" w:hAnsi="Calibri"/>
           <w:i/>
           <w:color w:val="374151"/>
-          <w:sz w:val="16"/>
+          <w:sz w:val="15"/>
         </w:rPr>
-        <w:t xml:space="preserve">  [AMD Spartan-7 FPGA • Verilog • C++ • Python]</w:t>
+        <w:t xml:space="preserve">  [AMD Spartan-7 XC7S25 • Vivado ILA • Verilog HDL • ESP8266 Wi-Fi]</w:t>
+      </w:r>
+      <w:r>
+        <w:rPr>
+          <w:rFonts w:ascii="Calibri" w:hAnsi="Calibri"/>
+          <w:color w:val="1F2937"/>
+          <w:sz w:val="15"/>
+        </w:rPr>
+        <w:t xml:space="preserve">  (github.com/arunjyotisarmarsece24-jpg/NeuroBIST-Edge)</w:t>
       </w:r>
     </w:p>
     <w:p>
       <w:pPr>
-        <w:spacing w:before="0" w:after="30" w:line="264" w:lineRule="auto"/>
+        <w:spacing w:before="0" w:after="20" w:line="264" w:lineRule="auto"/>
         <w:ind w:left="259"/>
       </w:pPr>
       <w:r>
         <w:rPr>
           <w:rFonts w:ascii="Calibri" w:hAnsi="Calibri"/>
           <w:color w:val="1F2937"/>
-          <w:sz w:val="17"/>
+          <w:sz w:val="16"/>
         </w:rPr>
-        <w:t>•  Closed and deployed on a physical Digilent Arty S7-25 (Spartan-7 XC7S25) on COM9 alongside an Arduino Nano hardware-in-the-loop (HIL) sidecar on COM10.</w:t>
+        <w:t>•  Engineered an autonomous fault-tolerant neuromorphic co-processor with integrated silicon Built-In Self-Test (BIST) and Mod-3 Residue Invariant self-healing datapath.</w:t>
       </w:r>
     </w:p>
     <w:p>
       <w:pPr>
-        <w:spacing w:before="0" w:after="30" w:line="264" w:lineRule="auto"/>
+        <w:spacing w:before="0" w:after="20" w:line="264" w:lineRule="auto"/>
         <w:ind w:left="259"/>
       </w:pPr>
       <w:r>
         <w:rPr>
           <w:rFonts w:ascii="Calibri" w:hAnsi="Calibri"/>
           <w:color w:val="1F2937"/>
-          <w:sz w:val="17"/>
+          <w:sz w:val="16"/>
         </w:rPr>
-        <w:t>•  Achieved timing closure at 322.06 MHz wire-speed (WNS = +0.894 ns positive slack) with 0 DSP slices (100% fixed-point LUT arithmetic, consuming only 240 / 14,600 LUTs = 1.64% silicon footprint).</w:t>
+        <w:t>•  Implemented real-time Vivado ILA hardware digital twin and asynchronous Clock Domain Crossing (CDC) telemetry ingestion via Espressif ESP8266 Wi-Fi bridge.</w:t>
       </w:r>
     </w:p>
     <w:p>
       <w:pPr>
-        <w:spacing w:before="0" w:after="30" w:line="264" w:lineRule="auto"/>
+        <w:spacing w:before="0" w:after="20" w:line="264" w:lineRule="auto"/>
         <w:ind w:left="259"/>
       </w:pPr>
       <w:r>
         <w:rPr>
           <w:rFonts w:ascii="Calibri" w:hAnsi="Calibri"/>
           <w:color w:val="1F2937"/>
-          <w:sz w:val="17"/>
+          <w:sz w:val="16"/>
         </w:rPr>
-        <w:t>•  Demonstrated ultra-low total on-chip dissipation of 82 milliwatts (0.082 W) — achieving 3,049x throughput/watt energy efficiency over enterprise Intel Xeon servers.</w:t>
-      </w:r>
-    </w:p>
-    <w:p>
-      <w:pPr>
-        <w:spacing w:before="0" w:after="30" w:line="264" w:lineRule="auto"/>
-        <w:ind w:left="259"/>
-      </w:pPr>
-      <w:r>
-        <w:rPr>
-          <w:rFonts w:ascii="Calibri" w:hAnsi="Calibri"/>
-          <w:color w:val="1F2937"/>
-          <w:sz w:val="17"/>
-        </w:rPr>
-        <w:t>•  Certified deterministic sub-microsecond latency (Median P50 = 1.230 µs, Tail P99 = 2.451 µs) beating institutional &lt;10.0 µs SLA requirements; validated walk-forward Deflated Sharpe Ratio DSR = 1.0000 across 500 permutations.</w:t>
-      </w:r>
-    </w:p>
-    <w:p>
-      <w:pPr>
-        <w:spacing w:before="0" w:after="30" w:line="264" w:lineRule="auto"/>
-        <w:ind w:left="259"/>
-      </w:pPr>
-      <w:r>
-        <w:rPr>
-          <w:rFonts w:ascii="Calibri" w:hAnsi="Calibri"/>
-          <w:color w:val="1F2937"/>
-          <w:sz w:val="17"/>
-        </w:rPr>
-        <w:t>•  Engineered full production software suite: automated verification harness (verify_system_master.py), C++ pybind11 bindings, and real-time Flask/WebSocket mission control dashboard (http://localhost:5000).</w:t>
+        <w:t>•  Demonstrated autonomous on-chip fault detection, error classification, and sub-cycle state recovery under live adversarial fault injection.</w:t>
       </w:r>
     </w:p>
     <w:p>
@@ -580,60 +573,54 @@
           <w:rFonts w:ascii="Calibri" w:hAnsi="Calibri"/>
           <w:b/>
           <w:color w:val="0A2240"/>
-          <w:sz w:val="18"/>
+          <w:sz w:val="17"/>
         </w:rPr>
-        <w:t>PIM Edge AI Cancer Diagnostic Accelerator (DVCon India 2025)</w:t>
+        <w:t>TRISHUL: Trusted Reconfigurable Integrated Security Hardware Unit for Lattice Cryptography</w:t>
       </w:r>
       <w:r>
         <w:rPr>
           <w:rFonts w:ascii="Calibri" w:hAnsi="Calibri"/>
           <w:i/>
           <w:color w:val="374151"/>
-          <w:sz w:val="16"/>
+          <w:sz w:val="15"/>
         </w:rPr>
-        <w:t xml:space="preserve">  [AMD Kintex-7 FPGA • VEGA RISC-V • Verilog • Systolic Arrays]</w:t>
+        <w:t xml:space="preserve">  [Spartan-7 FPGA • ASIC-Oriented RTL • Post-Quantum Cryptography • Verilog]</w:t>
+      </w:r>
+      <w:r>
+        <w:rPr>
+          <w:rFonts w:ascii="Calibri" w:hAnsi="Calibri"/>
+          <w:color w:val="1F2937"/>
+          <w:sz w:val="15"/>
+        </w:rPr>
+        <w:t xml:space="preserve">  (github.com/arunjyotisarmarsece24-jpg/TRISHUL)</w:t>
       </w:r>
     </w:p>
     <w:p>
       <w:pPr>
-        <w:spacing w:before="0" w:after="30" w:line="264" w:lineRule="auto"/>
+        <w:spacing w:before="0" w:after="20" w:line="264" w:lineRule="auto"/>
         <w:ind w:left="259"/>
       </w:pPr>
       <w:r>
         <w:rPr>
           <w:rFonts w:ascii="Calibri" w:hAnsi="Calibri"/>
           <w:color w:val="1F2937"/>
-          <w:sz w:val="17"/>
+          <w:sz w:val="16"/>
         </w:rPr>
-        <w:t>•  Architected a Processing-in-Memory (PIM) AI inference accelerator integrated with India's indigenous VEGA RISC-V processor on a Genesys-2 (Kintex-7 XC7K325T) FPGA board.</w:t>
+        <w:t>•  Architected an open-source parameterized, reconfigurable cryptographic compute architecture developed from microarchitecture to Spartan-7 FPGA implementation and ASIC-ready physical design.</w:t>
       </w:r>
     </w:p>
     <w:p>
       <w:pPr>
-        <w:spacing w:before="0" w:after="30" w:line="264" w:lineRule="auto"/>
+        <w:spacing w:before="0" w:after="20" w:line="264" w:lineRule="auto"/>
         <w:ind w:left="259"/>
       </w:pPr>
       <w:r>
         <w:rPr>
           <w:rFonts w:ascii="Calibri" w:hAnsi="Calibri"/>
           <w:color w:val="1F2937"/>
-          <w:sz w:val="17"/>
+          <w:sz w:val="16"/>
         </w:rPr>
-        <w:t>•  Embedded a Systolic Matrix Multiplication Engine (MME) directly into BRAM arrays to eliminate von Neumann memory bottlenecks; orchestrated DMA transfers via AXI4 memory-mapped interfaces.</w:t>
-      </w:r>
-    </w:p>
-    <w:p>
-      <w:pPr>
-        <w:spacing w:before="0" w:after="30" w:line="264" w:lineRule="auto"/>
-        <w:ind w:left="259"/>
-      </w:pPr>
-      <w:r>
-        <w:rPr>
-          <w:rFonts w:ascii="Calibri" w:hAnsi="Calibri"/>
-          <w:color w:val="1F2937"/>
-          <w:sz w:val="17"/>
-        </w:rPr>
-        <w:t>•  Executed quantized INT8 Convolutional Neural Network (CNN) / Vision Transformer (ViT) kernels for real-time histopathological slide classification with &lt;20 ms inference latency and &lt;6.8 W peak power.</w:t>
+        <w:t>•  Designed dedicated hardware accelerators for post-quantum lattice-based polynomial multiplication and high-throughput modular arithmetic with side-channel mitigation.</w:t>
       </w:r>
     </w:p>
     <w:p>
@@ -646,52 +633,120 @@
           <w:rFonts w:ascii="Calibri" w:hAnsi="Calibri"/>
           <w:b/>
           <w:color w:val="0A2240"/>
-          <w:sz w:val="18"/>
+          <w:sz w:val="17"/>
         </w:rPr>
-        <w:t>USR-X: Secure, Self-Testing, Power-Gated Gear-Shift Shift Register IP</w:t>
+        <w:t>VEGA RISC-V Processing-in-Memory AI Cancer Diagnostic Accelerator (DVCon India 2025)</w:t>
       </w:r>
       <w:r>
         <w:rPr>
           <w:rFonts w:ascii="Calibri" w:hAnsi="Calibri"/>
           <w:i/>
           <w:color w:val="374151"/>
-          <w:sz w:val="16"/>
+          <w:sz w:val="15"/>
         </w:rPr>
-        <w:t xml:space="preserve">  [Verilog HDL • Yosys • GTKWave • Python]</w:t>
+        <w:t xml:space="preserve">  [AMD Kintex-7 FPGA • Indigenous VEGA RISC-V Core • Systolic Array • AXI4]</w:t>
+      </w:r>
+      <w:r>
+        <w:rPr>
+          <w:rFonts w:ascii="Calibri" w:hAnsi="Calibri"/>
+          <w:color w:val="1F2937"/>
+          <w:sz w:val="15"/>
+        </w:rPr>
+        <w:t xml:space="preserve">  (Stage 2 Finalist &amp; Lead Architect (Team AstraVortex, IIT BHU))</w:t>
       </w:r>
     </w:p>
     <w:p>
       <w:pPr>
-        <w:spacing w:before="0" w:after="30" w:line="264" w:lineRule="auto"/>
+        <w:spacing w:before="0" w:after="20" w:line="264" w:lineRule="auto"/>
         <w:ind w:left="259"/>
       </w:pPr>
       <w:r>
         <w:rPr>
           <w:rFonts w:ascii="Calibri" w:hAnsi="Calibri"/>
           <w:color w:val="1F2937"/>
-          <w:sz w:val="17"/>
+          <w:sz w:val="16"/>
         </w:rPr>
-        <w:t>•  Designed and validated a computing register IP integrating segmented clock gating, multi-bit stride gear-shift barrel shifter, LFSR PRPG/MISR logic BIST, and stream scrambler scan chain security.</w:t>
+        <w:t>•  Architected a Processing-in-Memory (PIM) accelerator integrated with India's indigenous VEGA RISC-V processor on a Genesys-2 Kintex-7 FPGA board.</w:t>
       </w:r>
     </w:p>
     <w:p>
       <w:pPr>
-        <w:spacing w:before="0" w:after="30" w:line="264" w:lineRule="auto"/>
+        <w:spacing w:before="0" w:after="20" w:line="264" w:lineRule="auto"/>
         <w:ind w:left="259"/>
       </w:pPr>
       <w:r>
         <w:rPr>
           <w:rFonts w:ascii="Calibri" w:hAnsi="Calibri"/>
           <w:color w:val="1F2937"/>
-          <w:sz w:val="17"/>
+          <w:sz w:val="16"/>
         </w:rPr>
-        <w:t>•  Enabled dual-mode compute agility: operates as a bit-serial multiply-accumulate (MAC) core for MLPs/CNNs, an XNOR+popcount Binary Neural Network (BNN) accelerator, an FIR filter, and a stream cipher primitive.</w:t>
+        <w:t>•  Embedded a Systolic Matrix Multiplication Engine (MME) in BRAM arrays to eliminate von Neumann memory bottlenecks; executed INT8 CNN/ViT inference with &lt;20 ms latency and &lt;6.8 W peak power.</w:t>
       </w:r>
     </w:p>
     <w:p>
       <w:pPr>
         <w:keepNext/>
-        <w:spacing w:before="140" w:after="40"/>
+        <w:spacing w:before="60" w:after="20"/>
+      </w:pPr>
+      <w:r>
+        <w:rPr>
+          <w:rFonts w:ascii="Calibri" w:hAnsi="Calibri"/>
+          <w:b/>
+          <w:color w:val="0A2240"/>
+          <w:sz w:val="17"/>
+        </w:rPr>
+        <w:t>Architecting Modern BIST &amp; USR-X Gear-Shift Computing Register IP</w:t>
+      </w:r>
+      <w:r>
+        <w:rPr>
+          <w:rFonts w:ascii="Calibri" w:hAnsi="Calibri"/>
+          <w:i/>
+          <w:color w:val="374151"/>
+          <w:sz w:val="15"/>
+        </w:rPr>
+        <w:t xml:space="preserve">  [Verilog HDL • Yosys • GTKWave • Python • Built-In Self-Test]</w:t>
+      </w:r>
+      <w:r>
+        <w:rPr>
+          <w:rFonts w:ascii="Calibri" w:hAnsi="Calibri"/>
+          <w:color w:val="1F2937"/>
+          <w:sz w:val="15"/>
+        </w:rPr>
+        <w:t xml:space="preserve">  (github.com/arunjyotisarmarsece24-jpg/Architecting-Modern-Built-In-Self-Test)</w:t>
+      </w:r>
+    </w:p>
+    <w:p>
+      <w:pPr>
+        <w:spacing w:before="0" w:after="20" w:line="264" w:lineRule="auto"/>
+        <w:ind w:left="259"/>
+      </w:pPr>
+      <w:r>
+        <w:rPr>
+          <w:rFonts w:ascii="Calibri" w:hAnsi="Calibri"/>
+          <w:color w:val="1F2937"/>
+          <w:sz w:val="16"/>
+        </w:rPr>
+        <w:t>•  Authored architecture-first BIST research platform integrating LFSR PRPG, MISR compaction, and segmented gear-shift Universal Shift Register IP (USR-X).</w:t>
+      </w:r>
+    </w:p>
+    <w:p>
+      <w:pPr>
+        <w:spacing w:before="0" w:after="20" w:line="264" w:lineRule="auto"/>
+        <w:ind w:left="259"/>
+      </w:pPr>
+      <w:r>
+        <w:rPr>
+          <w:rFonts w:ascii="Calibri" w:hAnsi="Calibri"/>
+          <w:color w:val="1F2937"/>
+          <w:sz w:val="16"/>
+        </w:rPr>
+        <w:t>•  Enabled dual-mode compute agility: operates as a bit-serial multiply-accumulate (MAC) core for MLPs/CNNs, an XNOR+popcount Binary Neural Network (BNN) accelerator, and a stream cipher primitive.</w:t>
+      </w:r>
+    </w:p>
+    <w:p>
+      <w:pPr>
+        <w:keepNext/>
+        <w:spacing w:before="120" w:after="40"/>
         <w:pBdr>
           <w:bottom w:val="single" w:sz="8" w:space="1" w:color="0A2240"/>
         </w:pBdr>
@@ -701,7 +756,7 @@
           <w:rFonts w:ascii="Calibri" w:hAnsi="Calibri"/>
           <w:b/>
           <w:color w:val="0A2240"/>
-          <w:sz w:val="21"/>
+          <w:sz w:val="20"/>
         </w:rPr>
         <w:t>5. PEER-REVIEWED PUBLICATIONS &amp; INTELLECTUAL PROPERTY</w:t>
       </w:r>
@@ -716,7 +771,7 @@
           <w:rFonts w:ascii="Calibri" w:hAnsi="Calibri"/>
           <w:b/>
           <w:color w:val="0A2240"/>
-          <w:sz w:val="17"/>
+          <w:sz w:val="16"/>
         </w:rPr>
         <w:t xml:space="preserve">•  Refereed International Conference Paper (Lead Author &amp; Presenter): </w:t>
       </w:r>
@@ -724,7 +779,7 @@
         <w:rPr>
           <w:rFonts w:ascii="Calibri" w:hAnsi="Calibri"/>
           <w:color w:val="1F2937"/>
-          <w:sz w:val="17"/>
+          <w:sz w:val="16"/>
         </w:rPr>
         <w:t>Arunjyoti Sarma, Kuntal Kumar Das, Dr. L. Oppili Prasad, Dr. Ashutosh Kumar Dubey, "Piezoelectric Nanogenerator-Based Energy Harvesting System for Low-Power Bioelectronics," Proceedings of the 2026 IEEE 8th Eurasia Conference on Biomedical Engineering, Healthcare and Sustainability (IEEE-ECBIOS 2026), Tainan, Taiwan, October 2026. (Joint Research: Dept. of Electronics Engg. &amp; Dept. of Ceramic Engg., IIT (BHU) Varanasi).</w:t>
       </w:r>
@@ -739,7 +794,7 @@
           <w:rFonts w:ascii="Calibri" w:hAnsi="Calibri"/>
           <w:b/>
           <w:color w:val="0A2240"/>
-          <w:sz w:val="17"/>
+          <w:sz w:val="16"/>
         </w:rPr>
         <w:t xml:space="preserve">•  Patented Architecture &amp; Invention Disclosure (Sole Inventor): </w:t>
       </w:r>
@@ -747,7 +802,7 @@
         <w:rPr>
           <w:rFonts w:ascii="Calibri" w:hAnsi="Calibri"/>
           <w:color w:val="1F2937"/>
-          <w:sz w:val="17"/>
+          <w:sz w:val="16"/>
         </w:rPr>
         <w:t>Arunjyoti Sarma, "A Reconfigurable, Power-Gated Universal Shift Register with Multi-Stride Barrel Shifting and Built-In Self-Test for Bit-Serial Neural Acceleration and Cryptographic Primitives (USR-X)," Indian &amp; International PCT Patent Specification, Ref: USR-X/IIT-BHU/2025. (RTL verification &amp; silicon simulation closed).</w:t>
       </w:r>
@@ -762,7 +817,7 @@
           <w:rFonts w:ascii="Calibri" w:hAnsi="Calibri"/>
           <w:b/>
           <w:color w:val="0A2240"/>
-          <w:sz w:val="17"/>
+          <w:sz w:val="16"/>
         </w:rPr>
         <w:t xml:space="preserve">•  National Conference Technical Monograph (Lead Designer): </w:t>
       </w:r>
@@ -770,7 +825,7 @@
         <w:rPr>
           <w:rFonts w:ascii="Calibri" w:hAnsi="Calibri"/>
           <w:color w:val="1F2937"/>
-          <w:sz w:val="17"/>
+          <w:sz w:val="16"/>
         </w:rPr>
         <w:t>Arunjyoti Sarma, Swati Gupta, Updesh Kumar (Team AstraVortex, IIT (BHU) Varanasi), "Processing-in-Memory (PIM) Hardware Accelerator Integrated with Indigenous VEGA RISC-V Processor for Real-Time Edge Cancer Diagnostics," DVCon India 2025 Design Contest Technical Monograph, Bangalore, India.</w:t>
       </w:r>
@@ -785,30 +840,7 @@
           <w:rFonts w:ascii="Calibri" w:hAnsi="Calibri"/>
           <w:b/>
           <w:color w:val="0A2240"/>
-          <w:sz w:val="17"/>
-        </w:rPr>
-        <w:t xml:space="preserve">•  Competitive Research Fellowship Proposal (Principal Investigator): </w:t>
-      </w:r>
-      <w:r>
-        <w:rPr>
-          <w:rFonts w:ascii="Calibri" w:hAnsi="Calibri"/>
-          <w:color w:val="1F2937"/>
-          <w:sz w:val="17"/>
-        </w:rPr>
-        <w:t>Arunjyoti Sarma, "Sub-Microsecond Deterministic Limit Order Book Engine and Neuromorphic FPGA Acceleration on Sub-Watt Silicon," NVIDIA Graduate Fellowship Research Proposal &amp; Bitter Lesson Technical Manifesto (Certified Institute Nomination Dossier, IIT (BHU) Varanasi).</w:t>
-      </w:r>
-    </w:p>
-    <w:p>
-      <w:pPr>
-        <w:spacing w:before="40" w:after="40" w:line="264" w:lineRule="auto"/>
-        <w:ind w:left="259"/>
-      </w:pPr>
-      <w:r>
-        <w:rPr>
-          <w:rFonts w:ascii="Calibri" w:hAnsi="Calibri"/>
-          <w:b/>
-          <w:color w:val="0A2240"/>
-          <w:sz w:val="17"/>
+          <w:sz w:val="16"/>
         </w:rPr>
         <w:t xml:space="preserve">•  Journal Manuscript in Preparation (Targeted Submission): </w:t>
       </w:r>
@@ -816,7 +848,7 @@
         <w:rPr>
           <w:rFonts w:ascii="Calibri" w:hAnsi="Calibri"/>
           <w:color w:val="1F2937"/>
-          <w:sz w:val="17"/>
+          <w:sz w:val="16"/>
         </w:rPr>
         <w:t>Arunjyoti Sarma, Dr. L. Oppili Prasad, "Multi-Physical Strain Dynamics and Electromechanical Optimization of Serpentine Interconnects on Elastomeric Substrates for Continuous Structural Health Monitoring," Manuscript in preparation for submission to IEEE Sensors Journal.</w:t>
       </w:r>
@@ -824,7 +856,7 @@
     <w:p>
       <w:pPr>
         <w:keepNext/>
-        <w:spacing w:before="140" w:after="40"/>
+        <w:spacing w:before="120" w:after="40"/>
         <w:pBdr>
           <w:bottom w:val="single" w:sz="8" w:space="1" w:color="0A2240"/>
         </w:pBdr>
@@ -834,119 +866,9 @@
           <w:rFonts w:ascii="Calibri" w:hAnsi="Calibri"/>
           <w:b/>
           <w:color w:val="0A2240"/>
-          <w:sz w:val="21"/>
+          <w:sz w:val="20"/>
         </w:rPr>
-        <w:t>6. NATIONAL HONORS, FELLOWSHIPS &amp; ACADEMIC DISTINCTIONS</w:t>
-      </w:r>
-    </w:p>
-    <w:p>
-      <w:pPr>
-        <w:spacing w:before="40" w:after="40" w:line="264" w:lineRule="auto"/>
-        <w:ind w:left="259"/>
-      </w:pPr>
-      <w:r>
-        <w:rPr>
-          <w:rFonts w:ascii="Calibri" w:hAnsi="Calibri"/>
-          <w:b/>
-          <w:color w:val="0A2240"/>
-          <w:sz w:val="17"/>
-        </w:rPr>
-        <w:t xml:space="preserve">•  Ministry of Education (MoE) Institute Doctoral Research Fellowship (2024 – Present): </w:t>
-      </w:r>
-      <w:r>
-        <w:rPr>
-          <w:rFonts w:ascii="Calibri" w:hAnsi="Calibri"/>
-          <w:color w:val="1F2937"/>
-          <w:sz w:val="17"/>
-        </w:rPr>
-        <w:t>Conferred full-time Institute Research Fellowship by the Ministry of Education, Government of India, to pursue advanced doctoral research in the Department of Electronics Engineering, Indian Institute of Technology (BHU) Varanasi.</w:t>
-      </w:r>
-    </w:p>
-    <w:p>
-      <w:pPr>
-        <w:spacing w:before="40" w:after="40" w:line="264" w:lineRule="auto"/>
-        <w:ind w:left="259"/>
-      </w:pPr>
-      <w:r>
-        <w:rPr>
-          <w:rFonts w:ascii="Calibri" w:hAnsi="Calibri"/>
-          <w:b/>
-          <w:color w:val="0A2240"/>
-          <w:sz w:val="17"/>
-        </w:rPr>
-        <w:t xml:space="preserve">•  Dual-Discipline National Engineering Mastery (GATE — EC &amp; EE): </w:t>
-      </w:r>
-      <w:r>
-        <w:rPr>
-          <w:rFonts w:ascii="Calibri" w:hAnsi="Calibri"/>
-          <w:color w:val="1F2937"/>
-          <w:sz w:val="17"/>
-        </w:rPr>
-        <w:t>Four-time national qualifier in the Graduate Aptitude Test in Engineering across both Electronics &amp; Communication Engineering (EC) and Electrical Engineering (EE) — GATE 2024, GATE 2023, GATE 2021, and GATE 2019; demonstrates continuous, verified theoretical and applied command across solid-state physics, electromagnetics, signals, communication, and digital VLSI among top percentiles of engineers nationwide.</w:t>
-      </w:r>
-    </w:p>
-    <w:p>
-      <w:pPr>
-        <w:spacing w:before="40" w:after="40" w:line="264" w:lineRule="auto"/>
-        <w:ind w:left="259"/>
-      </w:pPr>
-      <w:r>
-        <w:rPr>
-          <w:rFonts w:ascii="Calibri" w:hAnsi="Calibri"/>
-          <w:b/>
-          <w:color w:val="0A2240"/>
-          <w:sz w:val="17"/>
-        </w:rPr>
-        <w:t xml:space="preserve">•  DVCon India 2025 National Hardware Design Contest (Stage 2 Finalist &amp; Lead Architect): </w:t>
-      </w:r>
-      <w:r>
-        <w:rPr>
-          <w:rFonts w:ascii="Calibri" w:hAnsi="Calibri"/>
-          <w:color w:val="1F2937"/>
-          <w:sz w:val="17"/>
-        </w:rPr>
-        <w:t>Selected to Stage 2 of the premier international Design and Verification Conference (DVCon India 2025) Design Contest as Lead Architect of Team AstraVortex (IIT BHU); architected an indigenous VEGA RISC-V integrated Processing-in-Memory (PIM) accelerator on AMD Kintex-7 FPGA for real-time edge histopathology classification (&lt;20 ms latency, 6.8 W peak power).</w:t>
-      </w:r>
-    </w:p>
-    <w:p>
-      <w:pPr>
-        <w:spacing w:before="40" w:after="40" w:line="264" w:lineRule="auto"/>
-        <w:ind w:left="259"/>
-      </w:pPr>
-      <w:r>
-        <w:rPr>
-          <w:rFonts w:ascii="Calibri" w:hAnsi="Calibri"/>
-          <w:b/>
-          <w:color w:val="0A2240"/>
-          <w:sz w:val="17"/>
-        </w:rPr>
-        <w:t xml:space="preserve">•  Institutional Research Nomination — NVIDIA Graduate Fellowship (2026): </w:t>
-      </w:r>
-      <w:r>
-        <w:rPr>
-          <w:rFonts w:ascii="Calibri" w:hAnsi="Calibri"/>
-          <w:color w:val="1F2937"/>
-          <w:sz w:val="17"/>
-        </w:rPr>
-        <w:t>Nominated by the Department of Electronics Engineering, IIT (BHU) Varanasi, for the international NVIDIA Graduate Fellowship, proposing a 322.06 MHz Spartan-7 FPGA deterministic limit order book engine with 0 DSP slices and 82 mW power dissipation, validating Sutton's 'Bitter Lesson' at microsecond line-rate.</w:t>
-      </w:r>
-    </w:p>
-    <w:p>
-      <w:pPr>
-        <w:keepNext/>
-        <w:spacing w:before="140" w:after="40"/>
-        <w:pBdr>
-          <w:bottom w:val="single" w:sz="8" w:space="1" w:color="0A2240"/>
-        </w:pBdr>
-      </w:pPr>
-      <w:r>
-        <w:rPr>
-          <w:rFonts w:ascii="Calibri" w:hAnsi="Calibri"/>
-          <w:b/>
-          <w:color w:val="0A2240"/>
-          <w:sz w:val="21"/>
-        </w:rPr>
-        <w:t>7. TECHNICAL SKILLS &amp; CORE COMPETENCIES</w:t>
+        <w:t>6. TECHNICAL SKILLS &amp; CORE COMPETENCIES</w:t>
       </w:r>
     </w:p>
     <w:p>
@@ -959,7 +881,7 @@
           <w:rFonts w:ascii="Calibri" w:hAnsi="Calibri"/>
           <w:b/>
           <w:color w:val="0A2240"/>
-          <w:sz w:val="17"/>
+          <w:sz w:val="16"/>
         </w:rPr>
         <w:t xml:space="preserve">•  FPGA &amp; Digital Hardware Design: </w:t>
       </w:r>
@@ -967,7 +889,7 @@
         <w:rPr>
           <w:rFonts w:ascii="Calibri" w:hAnsi="Calibri"/>
           <w:color w:val="1F2937"/>
-          <w:sz w:val="17"/>
+          <w:sz w:val="16"/>
         </w:rPr>
         <w:t>Verilog HDL, SystemVerilog, AMD Vivado Design Suite, Spartan-7 / Artix-7 / Kintex-7, Static Timing Analysis (STA), Clock Domain Crossing (CDC), Fixed-Point DSP-Free Arithmetic, RTL Synthesis, Yosys, Verilator, GTKWave, ModelSim, Hardware-in-the-Loop (HIL) Emulation.</w:t>
       </w:r>
@@ -982,7 +904,7 @@
           <w:rFonts w:ascii="Calibri" w:hAnsi="Calibri"/>
           <w:b/>
           <w:color w:val="0A2240"/>
-          <w:sz w:val="17"/>
+          <w:sz w:val="16"/>
         </w:rPr>
         <w:t xml:space="preserve">•  Electronic Design Automation (EDA) &amp; Simulation: </w:t>
       </w:r>
@@ -990,7 +912,7 @@
         <w:rPr>
           <w:rFonts w:ascii="Calibri" w:hAnsi="Calibri"/>
           <w:color w:val="1F2937"/>
-          <w:sz w:val="17"/>
+          <w:sz w:val="16"/>
         </w:rPr>
         <w:t>Cadence Innovus (P&amp;R, CTS), Cadence Genus (Synthesis), RTL-to-GDSII flow, COMSOL Multiphysics (Solid Mechanics, Electrostatics, Piezoelectric Devices, AC/DC), Tina-TI, LTspice, Proteus, Altium / KiCad PCB Layout.</w:t>
       </w:r>
@@ -1005,7 +927,7 @@
           <w:rFonts w:ascii="Calibri" w:hAnsi="Calibri"/>
           <w:b/>
           <w:color w:val="0A2240"/>
-          <w:sz w:val="17"/>
+          <w:sz w:val="16"/>
         </w:rPr>
         <w:t xml:space="preserve">•  Analog, Sensor &amp; Biomedical Hardware: </w:t>
       </w:r>
@@ -1013,7 +935,7 @@
         <w:rPr>
           <w:rFonts w:ascii="Calibri" w:hAnsi="Calibri"/>
           <w:color w:val="1F2937"/>
-          <w:sz w:val="17"/>
+          <w:sz w:val="16"/>
         </w:rPr>
         <w:t>Piezoelectric Nanogenerators (PVDF/PENG), Flexible Strain Sensing, Analog Front-End (AFE) Design, Instrumentation Amplifiers, Precision Bridge Readouts, MT3608 DC-DC Converters, Micro-Fabrication &amp; Hot-Press Polymer Processing.</w:t>
       </w:r>
@@ -1028,7 +950,7 @@
           <w:rFonts w:ascii="Calibri" w:hAnsi="Calibri"/>
           <w:b/>
           <w:color w:val="0A2240"/>
-          <w:sz w:val="17"/>
+          <w:sz w:val="16"/>
         </w:rPr>
         <w:t xml:space="preserve">•  Programming &amp; Embedded Firmware: </w:t>
       </w:r>
@@ -1036,7 +958,7 @@
         <w:rPr>
           <w:rFonts w:ascii="Calibri" w:hAnsi="Calibri"/>
           <w:color w:val="1F2937"/>
-          <w:sz w:val="17"/>
+          <w:sz w:val="16"/>
         </w:rPr>
         <w:t>C, C++ (C++17/20, pybind11), Python (NumPy, SciPy, Pandas, Scikit-learn, PyTorch), MATLAB / Simulink, Embedded C, Microchip PIC, ATmega (Arduino), ARM Cortex-M, ESP32, Raspberry Pi, Linux Shell / PowerShell.</w:t>
       </w:r>
@@ -1051,7 +973,7 @@
           <w:rFonts w:ascii="Calibri" w:hAnsi="Calibri"/>
           <w:b/>
           <w:color w:val="0A2240"/>
-          <w:sz w:val="17"/>
+          <w:sz w:val="16"/>
         </w:rPr>
         <w:t xml:space="preserve">•  Architectures, Protocols &amp; Web Telemetry: </w:t>
       </w:r>
@@ -1059,14 +981,14 @@
         <w:rPr>
           <w:rFonts w:ascii="Calibri" w:hAnsi="Calibri"/>
           <w:color w:val="1F2937"/>
-          <w:sz w:val="17"/>
+          <w:sz w:val="16"/>
         </w:rPr>
-        <w:t>RISC-V ISA (VEGA indigenous core), Processing-in-Memory (PIM), UART, SPI, I2C, AXI4-Lite/AXI4, FTDI High-Speed Serial, TCP/IP, WebSockets, Flask, Docker, Git, LaTeX, Signal Processing, Information Theory, Neural Networks, Real-Time Systems.</w:t>
+        <w:t>RISC-V ISA (VEGA indigenous core), Processing-in-Memory (PIM), Lattice Cryptography HW, UART, SPI, I2C, AXI4-Lite/AXI4, FTDI High-Speed Serial, TCP/IP, WebSockets, Flask, Docker, Git, LaTeX, Signal Processing, Information Theory, Neural Networks, Real-Time Systems.</w:t>
       </w:r>
     </w:p>
     <w:sectPr>
       <w:pgSz w:w="12240" w:h="15840"/>
-      <w:pgMar w:top="605" w:right="720" w:bottom="605" w:left="720" w:header="720" w:footer="720" w:gutter="0"/>
+      <w:pgMar w:top="576" w:right="691" w:bottom="576" w:left="691" w:header="720" w:footer="720" w:gutter="0"/>
       <w:cols w:space="720"/>
       <w:docGrid w:linePitch="360"/>
     </w:sectPr>

</xml_diff>